<commit_message>
feat(export): Wasserzeichen entfernt und Profil-Briefkopf im Nomicon-Design
- Hermes-Aenderung 14c9c64 uebernommen: Wasserzeichen VERTRAULICH im DOCX-Profil-Export
  entfernt (Nutzerentscheid 2026-10-14), Test angepasst
- anonymes_profil_master.docx: Nomicon-Lockup statt Commandeur-Logo, Kopfband in
  Nomicon-Navy #001C4A, Akzent #5A6C8A, Dokument-Eigenschaften auf Nomicon Partners
- docs/VERGLEICH.md: V-002 uebernommen, V-004 ergaenzt, Pruefstand fortgeschrieben
- docs/PROMPT_FUER_HERMES.md: Prompt fuer die Hermes-Sitzung zum neuen Verfahren

Co-Authored-By: Claude Sonnet 5.5 <noreply@anthropic.com>
Claude-Session: https://claude.ai/code/session_01FF8dzX2846YrW211PiEbhH
</commit_message>
<xml_diff>
--- a/backend/templates/anonymes_profil_master.docx
+++ b/backend/templates/anonymes_profil_master.docx
@@ -1572,7 +1572,7 @@
               <w:rFonts w:ascii="Arial" w:hAnsi="Arial" w:cs="Arial"/>
               <w:b/>
               <w:bCs/>
-              <w:color w:val="CB8F17"/>
+              <w:color w:val="5A6C8A"/>
               <w:lang w:val="en-US"/>
             </w:rPr>
           </w:pPr>
@@ -1641,7 +1641,7 @@
         <w:rFonts w:ascii="Arial" w:hAnsi="Arial" w:cs="Arial"/>
         <w:b/>
         <w:bCs/>
-        <w:color w:val="CB8F17"/>
+        <w:color w:val="5A6C8A"/>
         <w:lang w:val="en-US"/>
       </w:rPr>
     </w:pPr>
@@ -1651,7 +1651,7 @@
         <w:b/>
         <w:bCs/>
         <w:noProof/>
-        <w:color w:val="CB8F17"/>
+        <w:color w:val="5A6C8A"/>
         <w:lang w:eastAsia="de-DE"/>
       </w:rPr>
       <mc:AlternateContent>
@@ -1683,7 +1683,7 @@
                         <a:avLst/>
                       </a:prstGeom>
                       <a:solidFill>
-                        <a:srgbClr val="212C43"/>
+                        <a:srgbClr val="001C4A"/>
                       </a:solidFill>
                       <a:ln>
                         <a:noFill/>
@@ -1738,7 +1738,7 @@
         <w:rFonts w:ascii="Arial" w:hAnsi="Arial" w:cs="Arial"/>
         <w:b/>
         <w:bCs/>
-        <w:color w:val="CB8F17"/>
+        <w:color w:val="5A6C8A"/>
         <w:lang w:val="en-US"/>
       </w:rPr>
     </w:pPr>
@@ -1750,7 +1750,7 @@
         <w:rFonts w:ascii="Arial" w:hAnsi="Arial" w:cs="Arial"/>
         <w:b/>
         <w:bCs/>
-        <w:color w:val="CB8F17"/>
+        <w:color w:val="5A6C8A"/>
         <w:lang w:val="en-US"/>
       </w:rPr>
     </w:pPr>
@@ -1759,7 +1759,7 @@
         <w:rFonts w:ascii="Arial" w:hAnsi="Arial" w:cs="Arial"/>
         <w:b/>
         <w:bCs/>
-        <w:color w:val="CB8F17"/>
+        <w:color w:val="5A6C8A"/>
         <w:lang w:val="en-US"/>
       </w:rPr>
       <w:tab/>

</xml_diff>